<commit_message>
otp sms and email verification
</commit_message>
<xml_diff>
--- a/Software_Effort_Estimation.docx
+++ b/Software_Effort_Estimation.docx
@@ -256,7 +256,7 @@
                 <w:b w:val="0"/>
                 <w:sz w:val="24"/>
               </w:rPr>
-              <w:t>Configure SMS</w:t>
+              <w:t>Configure SMS/Email</w:t>
             </w:r>
           </w:p>
         </w:tc>
@@ -338,6 +338,53 @@
           </w:p>
         </w:tc>
       </w:tr>
+      <w:tr>
+        <w:tc>
+          <w:tcPr>
+            <w:tcW w:type="dxa" w:w="2880"/>
+          </w:tcPr>
+          <w:p>
+            <w:r>
+              <w:rPr>
+                <w:rFonts w:ascii="Times New Roman" w:hAnsi="Times New Roman"/>
+                <w:b w:val="0"/>
+                <w:sz w:val="24"/>
+              </w:rPr>
+              <w:t>Customer Portal Logins</w:t>
+            </w:r>
+          </w:p>
+        </w:tc>
+        <w:tc>
+          <w:tcPr>
+            <w:tcW w:type="dxa" w:w="2880"/>
+          </w:tcPr>
+          <w:p>
+            <w:r>
+              <w:rPr>
+                <w:rFonts w:ascii="Times New Roman" w:hAnsi="Times New Roman"/>
+                <w:b w:val="0"/>
+                <w:sz w:val="24"/>
+              </w:rPr>
+              <w:t>Average (3-7 trans)</w:t>
+            </w:r>
+          </w:p>
+        </w:tc>
+        <w:tc>
+          <w:tcPr>
+            <w:tcW w:type="dxa" w:w="2880"/>
+          </w:tcPr>
+          <w:p>
+            <w:r>
+              <w:rPr>
+                <w:rFonts w:ascii="Times New Roman" w:hAnsi="Times New Roman"/>
+                <w:b w:val="0"/>
+                <w:sz w:val="24"/>
+              </w:rPr>
+              <w:t>10</w:t>
+            </w:r>
+          </w:p>
+        </w:tc>
+      </w:tr>
     </w:tbl>
     <w:p/>
     <w:p>
@@ -350,7 +397,7 @@
           <w:b w:val="0"/>
           <w:sz w:val="24"/>
         </w:rPr>
-        <w:t>Total UUCW: 35</w:t>
+        <w:t>Total UUCW: 45</w:t>
       </w:r>
     </w:p>
     <w:p>
@@ -500,7 +547,7 @@
                 <w:b w:val="0"/>
                 <w:sz w:val="24"/>
               </w:rPr>
-              <w:t>Simple (SMS Receiver)</w:t>
+              <w:t>Complex (GUI Web Portal)</w:t>
             </w:r>
           </w:p>
         </w:tc>
@@ -515,7 +562,7 @@
                 <w:b w:val="0"/>
                 <w:sz w:val="24"/>
               </w:rPr>
-              <w:t>1</w:t>
+              <w:t>3</w:t>
             </w:r>
           </w:p>
         </w:tc>
@@ -532,7 +579,7 @@
           <w:b w:val="0"/>
           <w:sz w:val="24"/>
         </w:rPr>
-        <w:t>Total UAW: 4</w:t>
+        <w:t>Total UAW: 6</w:t>
       </w:r>
     </w:p>
     <w:p>
@@ -545,7 +592,7 @@
           <w:b w:val="0"/>
           <w:sz w:val="24"/>
         </w:rPr>
-        <w:t>Unadjusted Use Case Points (UUCP) = UUCW + UAW = 39</w:t>
+        <w:t>Unadjusted Use Case Points (UUCP) = UUCW + UAW = 51</w:t>
       </w:r>
     </w:p>
     <w:p>
@@ -573,7 +620,7 @@
           <w:b w:val="0"/>
           <w:sz w:val="24"/>
         </w:rPr>
-        <w:t>Technical Complexity Factor (TCF) estimated at 1.05 (Distributed System, Web App).</w:t>
+        <w:t>Technical Complexity Factor (TCF) estimated at 1.05 (Distributed System, React Web App, Supabase Edge Functions).</w:t>
       </w:r>
     </w:p>
     <w:p>
@@ -599,7 +646,7 @@
           <w:b w:val="0"/>
           <w:sz w:val="24"/>
         </w:rPr>
-        <w:t>UCP = UUCP x TCF x ECF = 39 x 1.05 x 0.95 = 38.9</w:t>
+        <w:t>UCP = UUCP x TCF x ECF = 51 x 1.05 x 0.95 = 50.87</w:t>
       </w:r>
     </w:p>
     <w:p>
@@ -640,7 +687,7 @@
           <w:b w:val="0"/>
           <w:sz w:val="24"/>
         </w:rPr>
-        <w:t>Total Estimated Effort = 38.9 x 20 = 778 man-hours.</w:t>
+        <w:t>Total Estimated Effort = 50.87 x 20 = 1017 man-hours.</w:t>
       </w:r>
     </w:p>
     <w:sectPr>

</xml_diff>

<commit_message>
fix adding user to companies or business errors
</commit_message>
<xml_diff>
--- a/Software_Effort_Estimation.docx
+++ b/Software_Effort_Estimation.docx
@@ -1108,6 +1108,434 @@
           </w:p>
         </w:tc>
       </w:tr>
+      <w:tr>
+        <w:tc>
+          <w:tcPr>
+            <w:tcW w:type="dxa" w:w="1728"/>
+            <w:shd w:fill="FFFFFF"/>
+          </w:tcPr>
+          <w:p>
+            <w:pPr>
+              <w:spacing w:line="288" w:lineRule="auto" w:after="40"/>
+            </w:pPr>
+            <w:r>
+              <w:rPr>
+                <w:rFonts w:ascii="Times New Roman" w:hAnsi="Times New Roman"/>
+                <w:b w:val="0"/>
+                <w:i w:val="0"/>
+                <w:color w:val="000000"/>
+                <w:sz w:val="20"/>
+              </w:rPr>
+              <w:t>UC-09</w:t>
+            </w:r>
+          </w:p>
+        </w:tc>
+        <w:tc>
+          <w:tcPr>
+            <w:tcW w:type="dxa" w:w="1728"/>
+            <w:shd w:fill="FFFFFF"/>
+          </w:tcPr>
+          <w:p>
+            <w:pPr>
+              <w:spacing w:line="288" w:lineRule="auto" w:after="40"/>
+            </w:pPr>
+            <w:r>
+              <w:rPr>
+                <w:rFonts w:ascii="Times New Roman" w:hAnsi="Times New Roman"/>
+                <w:b w:val="0"/>
+                <w:i w:val="0"/>
+                <w:color w:val="000000"/>
+                <w:sz w:val="20"/>
+              </w:rPr>
+              <w:t>User/Staff Management &amp; Auto-Credentials</w:t>
+            </w:r>
+          </w:p>
+        </w:tc>
+        <w:tc>
+          <w:tcPr>
+            <w:tcW w:type="dxa" w:w="1728"/>
+            <w:shd w:fill="FFFFFF"/>
+          </w:tcPr>
+          <w:p>
+            <w:pPr>
+              <w:spacing w:line="288" w:lineRule="auto" w:after="40"/>
+            </w:pPr>
+            <w:r>
+              <w:rPr>
+                <w:rFonts w:ascii="Times New Roman" w:hAnsi="Times New Roman"/>
+                <w:b w:val="0"/>
+                <w:i w:val="0"/>
+                <w:color w:val="000000"/>
+                <w:sz w:val="20"/>
+              </w:rPr>
+              <w:t>Average</w:t>
+            </w:r>
+          </w:p>
+        </w:tc>
+        <w:tc>
+          <w:tcPr>
+            <w:tcW w:type="dxa" w:w="1728"/>
+            <w:shd w:fill="FFFFFF"/>
+          </w:tcPr>
+          <w:p>
+            <w:pPr>
+              <w:spacing w:line="288" w:lineRule="auto" w:after="40"/>
+            </w:pPr>
+            <w:r>
+              <w:rPr>
+                <w:rFonts w:ascii="Times New Roman" w:hAnsi="Times New Roman"/>
+                <w:b w:val="0"/>
+                <w:i w:val="0"/>
+                <w:color w:val="000000"/>
+                <w:sz w:val="20"/>
+              </w:rPr>
+              <w:t>5 transactions</w:t>
+            </w:r>
+          </w:p>
+        </w:tc>
+        <w:tc>
+          <w:tcPr>
+            <w:tcW w:type="dxa" w:w="1728"/>
+            <w:shd w:fill="FFFFFF"/>
+          </w:tcPr>
+          <w:p>
+            <w:pPr>
+              <w:spacing w:line="288" w:lineRule="auto" w:after="40"/>
+            </w:pPr>
+            <w:r>
+              <w:rPr>
+                <w:rFonts w:ascii="Times New Roman" w:hAnsi="Times New Roman"/>
+                <w:b w:val="0"/>
+                <w:i w:val="0"/>
+                <w:color w:val="000000"/>
+                <w:sz w:val="20"/>
+              </w:rPr>
+              <w:t>10</w:t>
+            </w:r>
+          </w:p>
+        </w:tc>
+      </w:tr>
+      <w:tr>
+        <w:tc>
+          <w:tcPr>
+            <w:tcW w:type="dxa" w:w="1728"/>
+            <w:shd w:fill="F8FAFC"/>
+          </w:tcPr>
+          <w:p>
+            <w:pPr>
+              <w:spacing w:line="288" w:lineRule="auto" w:after="40"/>
+            </w:pPr>
+            <w:r>
+              <w:rPr>
+                <w:rFonts w:ascii="Times New Roman" w:hAnsi="Times New Roman"/>
+                <w:b w:val="0"/>
+                <w:i w:val="0"/>
+                <w:color w:val="000000"/>
+                <w:sz w:val="20"/>
+              </w:rPr>
+              <w:t>UC-10</w:t>
+            </w:r>
+          </w:p>
+        </w:tc>
+        <w:tc>
+          <w:tcPr>
+            <w:tcW w:type="dxa" w:w="1728"/>
+            <w:shd w:fill="F8FAFC"/>
+          </w:tcPr>
+          <w:p>
+            <w:pPr>
+              <w:spacing w:line="288" w:lineRule="auto" w:after="40"/>
+            </w:pPr>
+            <w:r>
+              <w:rPr>
+                <w:rFonts w:ascii="Times New Roman" w:hAnsi="Times New Roman"/>
+                <w:b w:val="0"/>
+                <w:i w:val="0"/>
+                <w:color w:val="000000"/>
+                <w:sz w:val="20"/>
+              </w:rPr>
+              <w:t>Granular RBAC Permissions (18 Permissions)</w:t>
+            </w:r>
+          </w:p>
+        </w:tc>
+        <w:tc>
+          <w:tcPr>
+            <w:tcW w:type="dxa" w:w="1728"/>
+            <w:shd w:fill="F8FAFC"/>
+          </w:tcPr>
+          <w:p>
+            <w:pPr>
+              <w:spacing w:line="288" w:lineRule="auto" w:after="40"/>
+            </w:pPr>
+            <w:r>
+              <w:rPr>
+                <w:rFonts w:ascii="Times New Roman" w:hAnsi="Times New Roman"/>
+                <w:b w:val="0"/>
+                <w:i w:val="0"/>
+                <w:color w:val="000000"/>
+                <w:sz w:val="20"/>
+              </w:rPr>
+              <w:t>Complex</w:t>
+            </w:r>
+          </w:p>
+        </w:tc>
+        <w:tc>
+          <w:tcPr>
+            <w:tcW w:type="dxa" w:w="1728"/>
+            <w:shd w:fill="F8FAFC"/>
+          </w:tcPr>
+          <w:p>
+            <w:pPr>
+              <w:spacing w:line="288" w:lineRule="auto" w:after="40"/>
+            </w:pPr>
+            <w:r>
+              <w:rPr>
+                <w:rFonts w:ascii="Times New Roman" w:hAnsi="Times New Roman"/>
+                <w:b w:val="0"/>
+                <w:i w:val="0"/>
+                <w:color w:val="000000"/>
+                <w:sz w:val="20"/>
+              </w:rPr>
+              <w:t>7 transactions</w:t>
+            </w:r>
+          </w:p>
+        </w:tc>
+        <w:tc>
+          <w:tcPr>
+            <w:tcW w:type="dxa" w:w="1728"/>
+            <w:shd w:fill="F8FAFC"/>
+          </w:tcPr>
+          <w:p>
+            <w:pPr>
+              <w:spacing w:line="288" w:lineRule="auto" w:after="40"/>
+            </w:pPr>
+            <w:r>
+              <w:rPr>
+                <w:rFonts w:ascii="Times New Roman" w:hAnsi="Times New Roman"/>
+                <w:b w:val="0"/>
+                <w:i w:val="0"/>
+                <w:color w:val="000000"/>
+                <w:sz w:val="20"/>
+              </w:rPr>
+              <w:t>15</w:t>
+            </w:r>
+          </w:p>
+        </w:tc>
+      </w:tr>
+      <w:tr>
+        <w:tc>
+          <w:tcPr>
+            <w:tcW w:type="dxa" w:w="1728"/>
+            <w:shd w:fill="FFFFFF"/>
+          </w:tcPr>
+          <w:p>
+            <w:pPr>
+              <w:spacing w:line="288" w:lineRule="auto" w:after="40"/>
+            </w:pPr>
+            <w:r>
+              <w:rPr>
+                <w:rFonts w:ascii="Times New Roman" w:hAnsi="Times New Roman"/>
+                <w:b w:val="0"/>
+                <w:i w:val="0"/>
+                <w:color w:val="000000"/>
+                <w:sz w:val="20"/>
+              </w:rPr>
+              <w:t>UC-11</w:t>
+            </w:r>
+          </w:p>
+        </w:tc>
+        <w:tc>
+          <w:tcPr>
+            <w:tcW w:type="dxa" w:w="1728"/>
+            <w:shd w:fill="FFFFFF"/>
+          </w:tcPr>
+          <w:p>
+            <w:pPr>
+              <w:spacing w:line="288" w:lineRule="auto" w:after="40"/>
+            </w:pPr>
+            <w:r>
+              <w:rPr>
+                <w:rFonts w:ascii="Times New Roman" w:hAnsi="Times New Roman"/>
+                <w:b w:val="0"/>
+                <w:i w:val="0"/>
+                <w:color w:val="000000"/>
+                <w:sz w:val="20"/>
+              </w:rPr>
+              <w:t>Customer Online Payment Checkout</w:t>
+            </w:r>
+          </w:p>
+        </w:tc>
+        <w:tc>
+          <w:tcPr>
+            <w:tcW w:type="dxa" w:w="1728"/>
+            <w:shd w:fill="FFFFFF"/>
+          </w:tcPr>
+          <w:p>
+            <w:pPr>
+              <w:spacing w:line="288" w:lineRule="auto" w:after="40"/>
+            </w:pPr>
+            <w:r>
+              <w:rPr>
+                <w:rFonts w:ascii="Times New Roman" w:hAnsi="Times New Roman"/>
+                <w:b w:val="0"/>
+                <w:i w:val="0"/>
+                <w:color w:val="000000"/>
+                <w:sz w:val="20"/>
+              </w:rPr>
+              <w:t>Average</w:t>
+            </w:r>
+          </w:p>
+        </w:tc>
+        <w:tc>
+          <w:tcPr>
+            <w:tcW w:type="dxa" w:w="1728"/>
+            <w:shd w:fill="FFFFFF"/>
+          </w:tcPr>
+          <w:p>
+            <w:pPr>
+              <w:spacing w:line="288" w:lineRule="auto" w:after="40"/>
+            </w:pPr>
+            <w:r>
+              <w:rPr>
+                <w:rFonts w:ascii="Times New Roman" w:hAnsi="Times New Roman"/>
+                <w:b w:val="0"/>
+                <w:i w:val="0"/>
+                <w:color w:val="000000"/>
+                <w:sz w:val="20"/>
+              </w:rPr>
+              <w:t>4 transactions</w:t>
+            </w:r>
+          </w:p>
+        </w:tc>
+        <w:tc>
+          <w:tcPr>
+            <w:tcW w:type="dxa" w:w="1728"/>
+            <w:shd w:fill="FFFFFF"/>
+          </w:tcPr>
+          <w:p>
+            <w:pPr>
+              <w:spacing w:line="288" w:lineRule="auto" w:after="40"/>
+            </w:pPr>
+            <w:r>
+              <w:rPr>
+                <w:rFonts w:ascii="Times New Roman" w:hAnsi="Times New Roman"/>
+                <w:b w:val="0"/>
+                <w:i w:val="0"/>
+                <w:color w:val="000000"/>
+                <w:sz w:val="20"/>
+              </w:rPr>
+              <w:t>10</w:t>
+            </w:r>
+          </w:p>
+        </w:tc>
+      </w:tr>
+      <w:tr>
+        <w:tc>
+          <w:tcPr>
+            <w:tcW w:type="dxa" w:w="1728"/>
+            <w:shd w:fill="F8FAFC"/>
+          </w:tcPr>
+          <w:p>
+            <w:pPr>
+              <w:spacing w:line="288" w:lineRule="auto" w:after="40"/>
+            </w:pPr>
+            <w:r>
+              <w:rPr>
+                <w:rFonts w:ascii="Times New Roman" w:hAnsi="Times New Roman"/>
+                <w:b w:val="0"/>
+                <w:i w:val="0"/>
+                <w:color w:val="000000"/>
+                <w:sz w:val="20"/>
+              </w:rPr>
+              <w:t>UC-12</w:t>
+            </w:r>
+          </w:p>
+        </w:tc>
+        <w:tc>
+          <w:tcPr>
+            <w:tcW w:type="dxa" w:w="1728"/>
+            <w:shd w:fill="F8FAFC"/>
+          </w:tcPr>
+          <w:p>
+            <w:pPr>
+              <w:spacing w:line="288" w:lineRule="auto" w:after="40"/>
+            </w:pPr>
+            <w:r>
+              <w:rPr>
+                <w:rFonts w:ascii="Times New Roman" w:hAnsi="Times New Roman"/>
+                <w:b w:val="0"/>
+                <w:i w:val="0"/>
+                <w:color w:val="000000"/>
+                <w:sz w:val="20"/>
+              </w:rPr>
+              <w:t>Real-Time Live Support Chat</w:t>
+            </w:r>
+          </w:p>
+        </w:tc>
+        <w:tc>
+          <w:tcPr>
+            <w:tcW w:type="dxa" w:w="1728"/>
+            <w:shd w:fill="F8FAFC"/>
+          </w:tcPr>
+          <w:p>
+            <w:pPr>
+              <w:spacing w:line="288" w:lineRule="auto" w:after="40"/>
+            </w:pPr>
+            <w:r>
+              <w:rPr>
+                <w:rFonts w:ascii="Times New Roman" w:hAnsi="Times New Roman"/>
+                <w:b w:val="0"/>
+                <w:i w:val="0"/>
+                <w:color w:val="000000"/>
+                <w:sz w:val="20"/>
+              </w:rPr>
+              <w:t>Average</w:t>
+            </w:r>
+          </w:p>
+        </w:tc>
+        <w:tc>
+          <w:tcPr>
+            <w:tcW w:type="dxa" w:w="1728"/>
+            <w:shd w:fill="F8FAFC"/>
+          </w:tcPr>
+          <w:p>
+            <w:pPr>
+              <w:spacing w:line="288" w:lineRule="auto" w:after="40"/>
+            </w:pPr>
+            <w:r>
+              <w:rPr>
+                <w:rFonts w:ascii="Times New Roman" w:hAnsi="Times New Roman"/>
+                <w:b w:val="0"/>
+                <w:i w:val="0"/>
+                <w:color w:val="000000"/>
+                <w:sz w:val="20"/>
+              </w:rPr>
+              <w:t>5 transactions</w:t>
+            </w:r>
+          </w:p>
+        </w:tc>
+        <w:tc>
+          <w:tcPr>
+            <w:tcW w:type="dxa" w:w="1728"/>
+            <w:shd w:fill="F8FAFC"/>
+          </w:tcPr>
+          <w:p>
+            <w:pPr>
+              <w:spacing w:line="288" w:lineRule="auto" w:after="40"/>
+            </w:pPr>
+            <w:r>
+              <w:rPr>
+                <w:rFonts w:ascii="Times New Roman" w:hAnsi="Times New Roman"/>
+                <w:b w:val="0"/>
+                <w:i w:val="0"/>
+                <w:color w:val="000000"/>
+                <w:sz w:val="20"/>
+              </w:rPr>
+              <w:t>10</w:t>
+            </w:r>
+          </w:p>
+        </w:tc>
+      </w:tr>
     </w:tbl>
     <w:p/>
     <w:p>
@@ -1122,7 +1550,7 @@
           <w:color w:val="000000"/>
           <w:sz w:val="24"/>
         </w:rPr>
-        <w:t>Total Unadjusted Use Case Weight (UUCW) = 70</w:t>
+        <w:t>Total Unadjusted Use Case Weight (UUCW) = 115</w:t>
       </w:r>
     </w:p>
     <w:p>
@@ -1785,7 +2213,7 @@
           <w:color w:val="000000"/>
           <w:sz w:val="24"/>
         </w:rPr>
-        <w:t>Unadjusted Use Case Points (UUCP) = UUCW + UAW = 70 + 13 = 83</w:t>
+        <w:t>Unadjusted Use Case Points (UUCP) = UUCW + UAW = 115 + 13 = 128</w:t>
       </w:r>
     </w:p>
     <w:p>
@@ -1846,7 +2274,7 @@
           <w:color w:val="000000"/>
           <w:sz w:val="24"/>
         </w:rPr>
-        <w:t>Adjusted Use Case Points (UCP) = UUCP * TCF * ECF = 83 * 1.04 * 0.92 = 79.41 UCP</w:t>
+        <w:t>Adjusted Use Case Points (UCP) = UUCP * TCF * ECF = 128 * 1.04 * 0.92 = 122.5 UCP</w:t>
       </w:r>
     </w:p>
     <w:p>
@@ -1892,7 +2320,7 @@
           <w:color w:val="000000"/>
           <w:sz w:val="24"/>
         </w:rPr>
-        <w:t>• Total Estimated Effort: 79.41 * 20 = 1,588.2 Person-Hours</w:t>
+        <w:t>• Total Estimated Effort: 122.5 * 20 = 2,450 Person-Hours</w:t>
       </w:r>
     </w:p>
     <w:p>

</xml_diff>

<commit_message>
added print job and job list count badges, customer portal jobs list count badge
</commit_message>
<xml_diff>
--- a/Software_Effort_Estimation.docx
+++ b/Software_Effort_Estimation.docx
@@ -1536,6 +1536,113 @@
           </w:p>
         </w:tc>
       </w:tr>
+      <w:tr>
+        <w:tc>
+          <w:tcPr>
+            <w:tcW w:type="dxa" w:w="1728"/>
+            <w:shd w:fill="FFFFFF"/>
+          </w:tcPr>
+          <w:p>
+            <w:pPr>
+              <w:spacing w:line="288" w:lineRule="auto" w:after="40"/>
+            </w:pPr>
+            <w:r>
+              <w:rPr>
+                <w:rFonts w:ascii="Times New Roman" w:hAnsi="Times New Roman"/>
+                <w:b w:val="0"/>
+                <w:i w:val="0"/>
+                <w:color w:val="000000"/>
+                <w:sz w:val="20"/>
+              </w:rPr>
+              <w:t>UC-13</w:t>
+            </w:r>
+          </w:p>
+        </w:tc>
+        <w:tc>
+          <w:tcPr>
+            <w:tcW w:type="dxa" w:w="1728"/>
+            <w:shd w:fill="FFFFFF"/>
+          </w:tcPr>
+          <w:p>
+            <w:pPr>
+              <w:spacing w:line="288" w:lineRule="auto" w:after="40"/>
+            </w:pPr>
+            <w:r>
+              <w:rPr>
+                <w:rFonts w:ascii="Times New Roman" w:hAnsi="Times New Roman"/>
+                <w:b w:val="0"/>
+                <w:i w:val="0"/>
+                <w:color w:val="000000"/>
+                <w:sz w:val="20"/>
+              </w:rPr>
+              <w:t>Audit &amp; Activity Logging Trail</w:t>
+            </w:r>
+          </w:p>
+        </w:tc>
+        <w:tc>
+          <w:tcPr>
+            <w:tcW w:type="dxa" w:w="1728"/>
+            <w:shd w:fill="FFFFFF"/>
+          </w:tcPr>
+          <w:p>
+            <w:pPr>
+              <w:spacing w:line="288" w:lineRule="auto" w:after="40"/>
+            </w:pPr>
+            <w:r>
+              <w:rPr>
+                <w:rFonts w:ascii="Times New Roman" w:hAnsi="Times New Roman"/>
+                <w:b w:val="0"/>
+                <w:i w:val="0"/>
+                <w:color w:val="000000"/>
+                <w:sz w:val="20"/>
+              </w:rPr>
+              <w:t>Average</w:t>
+            </w:r>
+          </w:p>
+        </w:tc>
+        <w:tc>
+          <w:tcPr>
+            <w:tcW w:type="dxa" w:w="1728"/>
+            <w:shd w:fill="FFFFFF"/>
+          </w:tcPr>
+          <w:p>
+            <w:pPr>
+              <w:spacing w:line="288" w:lineRule="auto" w:after="40"/>
+            </w:pPr>
+            <w:r>
+              <w:rPr>
+                <w:rFonts w:ascii="Times New Roman" w:hAnsi="Times New Roman"/>
+                <w:b w:val="0"/>
+                <w:i w:val="0"/>
+                <w:color w:val="000000"/>
+                <w:sz w:val="20"/>
+              </w:rPr>
+              <w:t>5 transactions</w:t>
+            </w:r>
+          </w:p>
+        </w:tc>
+        <w:tc>
+          <w:tcPr>
+            <w:tcW w:type="dxa" w:w="1728"/>
+            <w:shd w:fill="FFFFFF"/>
+          </w:tcPr>
+          <w:p>
+            <w:pPr>
+              <w:spacing w:line="288" w:lineRule="auto" w:after="40"/>
+            </w:pPr>
+            <w:r>
+              <w:rPr>
+                <w:rFonts w:ascii="Times New Roman" w:hAnsi="Times New Roman"/>
+                <w:b w:val="0"/>
+                <w:i w:val="0"/>
+                <w:color w:val="000000"/>
+                <w:sz w:val="20"/>
+              </w:rPr>
+              <w:t>10</w:t>
+            </w:r>
+          </w:p>
+        </w:tc>
+      </w:tr>
     </w:tbl>
     <w:p/>
     <w:p>
@@ -1550,7 +1657,7 @@
           <w:color w:val="000000"/>
           <w:sz w:val="24"/>
         </w:rPr>
-        <w:t>Total Unadjusted Use Case Weight (UUCW) = 115</w:t>
+        <w:t>Total Unadjusted Use Case Weight (UUCW) = 125</w:t>
       </w:r>
     </w:p>
     <w:p>
@@ -2213,7 +2320,7 @@
           <w:color w:val="000000"/>
           <w:sz w:val="24"/>
         </w:rPr>
-        <w:t>Unadjusted Use Case Points (UUCP) = UUCW + UAW = 115 + 13 = 128</w:t>
+        <w:t>Unadjusted Use Case Points (UUCP) = UUCW + UAW = 125 + 13 = 138</w:t>
       </w:r>
     </w:p>
     <w:p>
@@ -2274,7 +2381,7 @@
           <w:color w:val="000000"/>
           <w:sz w:val="24"/>
         </w:rPr>
-        <w:t>Adjusted Use Case Points (UCP) = UUCP * TCF * ECF = 128 * 1.04 * 0.92 = 122.5 UCP</w:t>
+        <w:t>Adjusted Use Case Points (UCP) = UUCP * TCF * ECF = 138 * 1.04 * 0.92 = 132.0 UCP</w:t>
       </w:r>
     </w:p>
     <w:p>
@@ -2320,7 +2427,7 @@
           <w:color w:val="000000"/>
           <w:sz w:val="24"/>
         </w:rPr>
-        <w:t>• Total Estimated Effort: 122.5 * 20 = 2,450 Person-Hours</w:t>
+        <w:t>• Total Estimated Effort: 132.0 * 20 = 2,640 Person-Hours</w:t>
       </w:r>
     </w:p>
     <w:p>

</xml_diff>